<commit_message>
ponytail: simplify theme toggle to native CSS, remove redundant favicon files, update site config & resume
</commit_message>
<xml_diff>
--- a/public/resume/Shaurya-Rawat-Resume.docx
+++ b/public/resume/Shaurya-Rawat-Resume.docx
@@ -1,18 +1,25 @@
 
 <file path=word/document.xml><?xml version="1.0" encoding="utf-8"?>
-<w:document xmlns:wpc="http://schemas.microsoft.com/office/word/2010/wordprocessingCanvas" xmlns:cx="http://schemas.microsoft.com/office/drawing/2014/chartex" xmlns:cx1="http://schemas.microsoft.com/office/drawing/2015/9/8/chartex" xmlns:cx2="http://schemas.microsoft.com/office/drawing/2015/10/21/chartex" xmlns:cx3="http://schemas.microsoft.com/office/drawing/2016/5/9/chartex" xmlns:cx4="http://schemas.microsoft.com/office/drawing/2016/5/10/chartex" xmlns:cx5="http://schemas.microsoft.com/office/drawing/2016/5/11/chartex" xmlns:cx6="http://schemas.microsoft.com/office/drawing/2016/5/12/chartex" xmlns:cx7="http://schemas.microsoft.com/office/drawing/2016/5/13/chartex" xmlns:cx8="http://schemas.microsoft.com/office/drawing/2016/5/14/chartex" xmlns:mc="http://schemas.openxmlformats.org/markup-compatibility/2006" xmlns:aink="http://schemas.microsoft.com/office/drawing/2016/ink" xmlns:am3d="http://schemas.microsoft.com/office/drawing/2017/model3d" xmlns:o="urn:schemas-microsoft-com:office:office" xmlns:oel="http://schemas.microsoft.com/office/2019/extlst" xmlns:r="http://schemas.openxmlformats.org/officeDocument/2006/relationships" xmlns:m="http://schemas.openxmlformats.org/officeDocument/2006/math" xmlns:v="urn:schemas-microsoft-com:vml" xmlns:wp14="http://schemas.microsoft.com/office/word/2010/wordprocessingDrawing" xmlns:wp="http://schemas.openxmlformats.org/drawingml/2006/wordprocessingDrawing" xmlns:w10="urn:schemas-microsoft-com:office:word" xmlns:w="http://schemas.openxmlformats.org/wordprocessingml/2006/main" xmlns:w14="http://schemas.microsoft.com/office/word/2010/wordml" xmlns:w15="http://schemas.microsoft.com/office/word/2012/wordml" xmlns:w16cei="http://schemas.microsoft.com/office/word/2026/wordml/cei" xmlns:w16cex="http://schemas.microsoft.com/office/word/2018/wordml/cex" xmlns:w16cid="http://schemas.microsoft.com/office/word/2016/wordml/cid" xmlns:w16="http://schemas.microsoft.com/office/word/2018/wordml" xmlns:w16du="http://schemas.microsoft.com/office/word/2023/wordml/word16du" xmlns:w16sdtdh="http://schemas.microsoft.com/office/word/2020/wordml/sdtdatahash" xmlns:w16sdtfl="http://schemas.microsoft.com/office/word/2024/wordml/sdtformatlock" xmlns:w16se="http://schemas.microsoft.com/office/word/2015/wordml/symex" xmlns:wpg="http://schemas.microsoft.com/office/word/2010/wordprocessingGroup" xmlns:wpi="http://schemas.microsoft.com/office/word/2010/wordprocessingInk" xmlns:wne="http://schemas.microsoft.com/office/word/2006/wordml" xmlns:wps="http://schemas.microsoft.com/office/word/2010/wordprocessingShape" mc:Ignorable="w14 w15 w16se w16cid w16 w16cex w16sdtdh w16sdtfl w16du wp14">
+<w:document xmlns:wpc="http://schemas.microsoft.com/office/word/2010/wordprocessingCanvas" xmlns:cx="http://schemas.microsoft.com/office/drawing/2014/chartex" xmlns:cx1="http://schemas.microsoft.com/office/drawing/2015/9/8/chartex" xmlns:cx2="http://schemas.microsoft.com/office/drawing/2015/10/21/chartex" xmlns:cx3="http://schemas.microsoft.com/office/drawing/2016/5/9/chartex" xmlns:cx4="http://schemas.microsoft.com/office/drawing/2016/5/10/chartex" xmlns:cx5="http://schemas.microsoft.com/office/drawing/2016/5/11/chartex" xmlns:cx6="http://schemas.microsoft.com/office/drawing/2016/5/12/chartex" xmlns:cx7="http://schemas.microsoft.com/office/drawing/2016/5/13/chartex" xmlns:cx8="http://schemas.microsoft.com/office/drawing/2016/5/14/chartex" xmlns:mc="http://schemas.openxmlformats.org/markup-compatibility/2006" xmlns:aink="http://schemas.microsoft.com/office/drawing/2016/ink" xmlns:am3d="http://schemas.microsoft.com/office/drawing/2017/model3d" xmlns:o="urn:schemas-microsoft-com:office:office" xmlns:oel="http://schemas.microsoft.com/office/2019/extlst" xmlns:r="http://schemas.openxmlformats.org/officeDocument/2006/relationships" xmlns:m="http://schemas.openxmlformats.org/officeDocument/2006/math" xmlns:v="urn:schemas-microsoft-com:vml" xmlns:wp14="http://schemas.microsoft.com/office/word/2010/wordprocessingDrawing" xmlns:wp="http://schemas.openxmlformats.org/drawingml/2006/wordprocessingDrawing" xmlns:w10="urn:schemas-microsoft-com:office:word" xmlns:w="http://schemas.openxmlformats.org/wordprocessingml/2006/main" xmlns:w14="http://schemas.microsoft.com/office/word/2010/wordml" xmlns:w15="http://schemas.microsoft.com/office/word/2012/wordml" xmlns:w16cex="http://schemas.microsoft.com/office/word/2018/wordml/cex" xmlns:w16cid="http://schemas.microsoft.com/office/word/2016/wordml/cid" xmlns:w16="http://schemas.microsoft.com/office/word/2018/wordml" xmlns:w16du="http://schemas.microsoft.com/office/word/2023/wordml/word16du" xmlns:w16sdtdh="http://schemas.microsoft.com/office/word/2020/wordml/sdtdatahash" xmlns:w16sdtfl="http://schemas.microsoft.com/office/word/2024/wordml/sdtformatlock" xmlns:w16se="http://schemas.microsoft.com/office/word/2015/wordml/symex" xmlns:wpg="http://schemas.microsoft.com/office/word/2010/wordprocessingGroup" xmlns:wpi="http://schemas.microsoft.com/office/word/2010/wordprocessingInk" xmlns:wne="http://schemas.microsoft.com/office/word/2006/wordml" xmlns:wps="http://schemas.microsoft.com/office/word/2010/wordprocessingShape" mc:Ignorable="w14 w15 w16se w16cid w16 w16cex w16sdtdh w16sdtfl w16du wp14">
   <w:body>
     <w:p>
       <w:pPr>
         <w:spacing w:after="20" w:line="240" w:lineRule="auto"/>
+        <w:ind w:firstLine="720"/>
         <w:jc w:val="center"/>
+        <w:rPr>
+          <w:rFonts w:cs="Calibri"/>
+          <w:sz w:val="22"/>
+          <w:szCs w:val="24"/>
+        </w:rPr>
       </w:pPr>
       <w:r>
         <w:rPr>
           <w:rFonts w:cs="Calibri"/>
           <w:b/>
           <w:color w:val="000000"/>
-          <w:sz w:val="44"/>
+          <w:sz w:val="48"/>
+          <w:szCs w:val="24"/>
         </w:rPr>
         <w:t>Shaurya Rawat</w:t>
       </w:r>
@@ -21,12 +28,17 @@
       <w:pPr>
         <w:spacing w:after="0" w:line="240" w:lineRule="auto"/>
         <w:jc w:val="center"/>
+        <w:rPr>
+          <w:rFonts w:cs="Calibri"/>
+          <w:sz w:val="22"/>
+          <w:szCs w:val="24"/>
+        </w:rPr>
       </w:pPr>
       <w:r>
         <w:rPr>
           <w:rFonts w:cs="Calibri"/>
           <w:color w:val="000000"/>
-          <w:sz w:val="18"/>
+          <w:szCs w:val="24"/>
         </w:rPr>
         <w:t>+91-8368817060  |  Delhi, India  |  shauryarawat29@gmail.com</w:t>
       </w:r>
@@ -35,20 +47,26 @@
       <w:pPr>
         <w:spacing w:after="60" w:line="240" w:lineRule="auto"/>
         <w:jc w:val="center"/>
+        <w:rPr>
+          <w:rFonts w:cs="Calibri"/>
+          <w:sz w:val="22"/>
+          <w:szCs w:val="24"/>
+        </w:rPr>
       </w:pPr>
       <w:r>
         <w:rPr>
           <w:rFonts w:cs="Calibri"/>
           <w:color w:val="000000"/>
-          <w:sz w:val="18"/>
+          <w:szCs w:val="24"/>
         </w:rPr>
         <w:t xml:space="preserve">LinkedIn: </w:t>
       </w:r>
       <w:hyperlink r:id="rId6">
         <w:r>
           <w:rPr>
+            <w:rFonts w:cs="Calibri"/>
             <w:color w:val="1F4E79"/>
-            <w:sz w:val="18"/>
+            <w:szCs w:val="24"/>
             <w:u w:val="single"/>
           </w:rPr>
           <w:t>linkedin.com/in/shaurya-rawat-8751922b5</w:t>
@@ -58,15 +76,16 @@
         <w:rPr>
           <w:rFonts w:cs="Calibri"/>
           <w:color w:val="000000"/>
-          <w:sz w:val="18"/>
+          <w:szCs w:val="24"/>
         </w:rPr>
         <w:t xml:space="preserve">   |   GitHub: </w:t>
       </w:r>
       <w:hyperlink r:id="rId7">
         <w:r>
           <w:rPr>
+            <w:rFonts w:cs="Calibri"/>
             <w:color w:val="1F4E79"/>
-            <w:sz w:val="18"/>
+            <w:szCs w:val="24"/>
             <w:u w:val="single"/>
           </w:rPr>
           <w:t>github.com/ShauryaRawat29</w:t>
@@ -75,17 +94,886 @@
     </w:p>
     <w:p>
       <w:pPr>
+        <w:spacing w:after="60" w:line="240" w:lineRule="auto"/>
+        <w:jc w:val="center"/>
+        <w:rPr>
+          <w:rFonts w:cs="Calibri"/>
+          <w:sz w:val="22"/>
+          <w:szCs w:val="24"/>
+        </w:rPr>
+      </w:pPr>
+    </w:p>
+    <w:p>
+      <w:pPr>
         <w:pBdr>
           <w:bottom w:val="single" w:sz="8" w:space="2" w:color="1F4E79"/>
         </w:pBdr>
-        <w:spacing w:before="100" w:after="60" w:line="240" w:lineRule="auto"/>
+        <w:spacing w:before="80" w:after="40" w:line="240" w:lineRule="auto"/>
+        <w:rPr>
+          <w:rFonts w:cs="Calibri"/>
+          <w:sz w:val="22"/>
+          <w:szCs w:val="24"/>
+        </w:rPr>
       </w:pPr>
       <w:r>
         <w:rPr>
           <w:rFonts w:cs="Calibri"/>
           <w:b/>
           <w:color w:val="1F4E79"/>
+          <w:sz w:val="24"/>
+          <w:szCs w:val="24"/>
+        </w:rPr>
+        <w:t>EXPERIENCE</w:t>
+      </w:r>
+    </w:p>
+    <w:p>
+      <w:pPr>
+        <w:spacing w:before="50" w:after="20" w:line="240" w:lineRule="auto"/>
+        <w:rPr>
+          <w:rFonts w:cs="Calibri"/>
           <w:sz w:val="22"/>
+          <w:szCs w:val="24"/>
+        </w:rPr>
+      </w:pPr>
+      <w:r>
+        <w:rPr>
+          <w:rFonts w:cs="Calibri"/>
+          <w:b/>
+          <w:color w:val="000000"/>
+          <w:sz w:val="22"/>
+          <w:szCs w:val="24"/>
+        </w:rPr>
+        <w:t xml:space="preserve">Artificial Intelligence </w:t>
+      </w:r>
+      <w:r>
+        <w:rPr>
+          <w:rFonts w:cs="Calibri"/>
+          <w:b/>
+          <w:color w:val="000000"/>
+          <w:sz w:val="22"/>
+          <w:szCs w:val="24"/>
+        </w:rPr>
+        <w:t xml:space="preserve">Engineering </w:t>
+      </w:r>
+      <w:r>
+        <w:rPr>
+          <w:rFonts w:cs="Calibri"/>
+          <w:b/>
+          <w:color w:val="000000"/>
+          <w:sz w:val="22"/>
+          <w:szCs w:val="24"/>
+        </w:rPr>
+        <w:t>Intern</w:t>
+      </w:r>
+      <w:r>
+        <w:rPr>
+          <w:rFonts w:cs="Calibri"/>
+          <w:b/>
+          <w:color w:val="444444"/>
+          <w:sz w:val="22"/>
+          <w:szCs w:val="24"/>
+        </w:rPr>
+        <w:t xml:space="preserve">   |   </w:t>
+      </w:r>
+      <w:r>
+        <w:rPr>
+          <w:rFonts w:cs="Calibri"/>
+          <w:b/>
+          <w:color w:val="444444"/>
+          <w:sz w:val="22"/>
+          <w:szCs w:val="24"/>
+        </w:rPr>
+        <w:tab/>
+      </w:r>
+      <w:r>
+        <w:rPr>
+          <w:rFonts w:cs="Calibri"/>
+          <w:b/>
+          <w:color w:val="444444"/>
+          <w:sz w:val="22"/>
+          <w:szCs w:val="24"/>
+        </w:rPr>
+        <w:tab/>
+      </w:r>
+      <w:r>
+        <w:rPr>
+          <w:rFonts w:cs="Calibri"/>
+          <w:b/>
+          <w:color w:val="444444"/>
+          <w:sz w:val="22"/>
+          <w:szCs w:val="24"/>
+        </w:rPr>
+        <w:tab/>
+      </w:r>
+      <w:r>
+        <w:rPr>
+          <w:rFonts w:cs="Calibri"/>
+          <w:b/>
+          <w:color w:val="444444"/>
+          <w:sz w:val="22"/>
+          <w:szCs w:val="24"/>
+        </w:rPr>
+        <w:tab/>
+      </w:r>
+      <w:r>
+        <w:rPr>
+          <w:rFonts w:cs="Calibri"/>
+          <w:b/>
+          <w:color w:val="444444"/>
+          <w:sz w:val="22"/>
+          <w:szCs w:val="24"/>
+        </w:rPr>
+        <w:tab/>
+      </w:r>
+      <w:r>
+        <w:rPr>
+          <w:rFonts w:cs="Calibri"/>
+          <w:b/>
+          <w:color w:val="444444"/>
+          <w:sz w:val="22"/>
+          <w:szCs w:val="24"/>
+        </w:rPr>
+        <w:tab/>
+      </w:r>
+      <w:r>
+        <w:rPr>
+          <w:rFonts w:cs="Calibri"/>
+          <w:b/>
+          <w:color w:val="444444"/>
+          <w:sz w:val="22"/>
+          <w:szCs w:val="24"/>
+        </w:rPr>
+        <w:t>May 2026 – Jul 2026</w:t>
+      </w:r>
+    </w:p>
+    <w:p>
+      <w:pPr>
+        <w:spacing w:after="20" w:line="240" w:lineRule="auto"/>
+        <w:rPr>
+          <w:rFonts w:cs="Calibri"/>
+          <w:sz w:val="22"/>
+          <w:szCs w:val="24"/>
+        </w:rPr>
+      </w:pPr>
+      <w:r>
+        <w:rPr>
+          <w:rFonts w:cs="Calibri"/>
+          <w:i/>
+          <w:color w:val="444444"/>
+          <w:szCs w:val="24"/>
+        </w:rPr>
+        <w:t xml:space="preserve">Syphyr Pvt. Ltd.   |   </w:t>
+      </w:r>
+      <w:hyperlink r:id="rId8">
+        <w:r>
+          <w:rPr>
+            <w:rFonts w:cs="Calibri"/>
+            <w:color w:val="1F4E79"/>
+            <w:szCs w:val="24"/>
+            <w:u w:val="single"/>
+          </w:rPr>
+          <w:t>curadocs.in</w:t>
+        </w:r>
+      </w:hyperlink>
+    </w:p>
+    <w:p>
+      <w:pPr>
+        <w:spacing w:after="10" w:line="240" w:lineRule="auto"/>
+        <w:ind w:left="245" w:hanging="245"/>
+        <w:rPr>
+          <w:rFonts w:cs="Calibri"/>
+          <w:sz w:val="22"/>
+          <w:szCs w:val="24"/>
+        </w:rPr>
+      </w:pPr>
+      <w:r>
+        <w:rPr>
+          <w:rFonts w:cs="Calibri"/>
+          <w:color w:val="000000"/>
+          <w:sz w:val="22"/>
+          <w:szCs w:val="24"/>
+        </w:rPr>
+        <w:t xml:space="preserve">•  Shipped </w:t>
+      </w:r>
+      <w:r>
+        <w:rPr>
+          <w:rFonts w:cs="Calibri"/>
+          <w:b/>
+          <w:color w:val="000000"/>
+          <w:sz w:val="22"/>
+          <w:szCs w:val="24"/>
+        </w:rPr>
+        <w:t>3 proof-of-concept AI applications</w:t>
+      </w:r>
+      <w:r>
+        <w:rPr>
+          <w:rFonts w:cs="Calibri"/>
+          <w:color w:val="000000"/>
+          <w:sz w:val="22"/>
+          <w:szCs w:val="24"/>
+        </w:rPr>
+        <w:t xml:space="preserve"> in Python — document triage, intent classification, data extraction; 2 advanced to live client demos.</w:t>
+      </w:r>
+    </w:p>
+    <w:p>
+      <w:pPr>
+        <w:spacing w:after="10" w:line="240" w:lineRule="auto"/>
+        <w:ind w:left="245" w:hanging="245"/>
+        <w:rPr>
+          <w:rFonts w:cs="Calibri"/>
+          <w:sz w:val="22"/>
+          <w:szCs w:val="24"/>
+        </w:rPr>
+      </w:pPr>
+      <w:r>
+        <w:rPr>
+          <w:rFonts w:cs="Calibri"/>
+          <w:color w:val="000000"/>
+          <w:sz w:val="22"/>
+          <w:szCs w:val="24"/>
+        </w:rPr>
+        <w:t xml:space="preserve">•  Built automated evaluation harnesses across </w:t>
+      </w:r>
+      <w:r>
+        <w:rPr>
+          <w:rFonts w:cs="Calibri"/>
+          <w:b/>
+          <w:color w:val="000000"/>
+          <w:sz w:val="22"/>
+          <w:szCs w:val="24"/>
+        </w:rPr>
+        <w:t>5+ client models</w:t>
+      </w:r>
+      <w:r>
+        <w:rPr>
+          <w:rFonts w:cs="Calibri"/>
+          <w:color w:val="000000"/>
+          <w:sz w:val="22"/>
+          <w:szCs w:val="24"/>
+        </w:rPr>
+        <w:t xml:space="preserve">, cutting manual testing effort </w:t>
+      </w:r>
+      <w:r>
+        <w:rPr>
+          <w:rFonts w:cs="Calibri"/>
+          <w:b/>
+          <w:color w:val="000000"/>
+          <w:sz w:val="22"/>
+          <w:szCs w:val="24"/>
+        </w:rPr>
+        <w:t>~30%</w:t>
+      </w:r>
+      <w:r>
+        <w:rPr>
+          <w:rFonts w:cs="Calibri"/>
+          <w:color w:val="000000"/>
+          <w:sz w:val="22"/>
+          <w:szCs w:val="24"/>
+        </w:rPr>
+        <w:t>.</w:t>
+      </w:r>
+    </w:p>
+    <w:p>
+      <w:pPr>
+        <w:pBdr>
+          <w:bottom w:val="single" w:sz="8" w:space="2" w:color="1F4E79"/>
+        </w:pBdr>
+        <w:spacing w:before="80" w:after="40" w:line="240" w:lineRule="auto"/>
+        <w:rPr>
+          <w:rFonts w:cs="Calibri"/>
+          <w:sz w:val="22"/>
+          <w:szCs w:val="24"/>
+        </w:rPr>
+      </w:pPr>
+      <w:r>
+        <w:rPr>
+          <w:rFonts w:cs="Calibri"/>
+          <w:b/>
+          <w:color w:val="1F4E79"/>
+          <w:sz w:val="24"/>
+          <w:szCs w:val="24"/>
+        </w:rPr>
+        <w:t>PROJECTS</w:t>
+      </w:r>
+    </w:p>
+    <w:p>
+      <w:pPr>
+        <w:spacing w:before="50" w:after="20" w:line="240" w:lineRule="auto"/>
+        <w:rPr>
+          <w:rFonts w:cs="Calibri"/>
+          <w:sz w:val="22"/>
+          <w:szCs w:val="24"/>
+        </w:rPr>
+      </w:pPr>
+      <w:r>
+        <w:rPr>
+          <w:rFonts w:cs="Calibri"/>
+          <w:b/>
+          <w:color w:val="000000"/>
+          <w:sz w:val="22"/>
+          <w:szCs w:val="24"/>
+        </w:rPr>
+        <w:t>PhishGuard — AI-Powered Phishing URL Detection</w:t>
+      </w:r>
+    </w:p>
+    <w:p>
+      <w:pPr>
+        <w:spacing w:after="10" w:line="240" w:lineRule="auto"/>
+        <w:ind w:left="245" w:hanging="245"/>
+        <w:rPr>
+          <w:rFonts w:cs="Calibri"/>
+          <w:sz w:val="22"/>
+          <w:szCs w:val="24"/>
+        </w:rPr>
+      </w:pPr>
+      <w:r>
+        <w:rPr>
+          <w:rFonts w:cs="Calibri"/>
+          <w:color w:val="000000"/>
+          <w:sz w:val="22"/>
+          <w:szCs w:val="24"/>
+        </w:rPr>
+        <w:t xml:space="preserve">•  Trained an XGBoost classifier on </w:t>
+      </w:r>
+      <w:r>
+        <w:rPr>
+          <w:rFonts w:cs="Calibri"/>
+          <w:b/>
+          <w:color w:val="000000"/>
+          <w:sz w:val="22"/>
+          <w:szCs w:val="24"/>
+        </w:rPr>
+        <w:t>468K URLs</w:t>
+      </w:r>
+      <w:r>
+        <w:rPr>
+          <w:rFonts w:cs="Calibri"/>
+          <w:color w:val="000000"/>
+          <w:sz w:val="22"/>
+          <w:szCs w:val="24"/>
+        </w:rPr>
+        <w:t xml:space="preserve"> with 33 engineered lexical/structural features</w:t>
+      </w:r>
+      <w:r>
+        <w:rPr>
+          <w:rFonts w:cs="Calibri"/>
+          <w:color w:val="000000"/>
+          <w:sz w:val="22"/>
+          <w:szCs w:val="24"/>
+        </w:rPr>
+        <w:t>.</w:t>
+      </w:r>
+    </w:p>
+    <w:p>
+      <w:pPr>
+        <w:spacing w:after="10" w:line="240" w:lineRule="auto"/>
+        <w:ind w:left="245" w:hanging="245"/>
+        <w:rPr>
+          <w:rFonts w:cs="Calibri"/>
+          <w:sz w:val="22"/>
+          <w:szCs w:val="24"/>
+        </w:rPr>
+      </w:pPr>
+      <w:r>
+        <w:rPr>
+          <w:rFonts w:cs="Calibri"/>
+          <w:color w:val="000000"/>
+          <w:sz w:val="22"/>
+          <w:szCs w:val="24"/>
+        </w:rPr>
+        <w:t xml:space="preserve">•  SHAP-explained predictions with calibrated confidence; </w:t>
+      </w:r>
+      <w:r>
+        <w:rPr>
+          <w:rFonts w:cs="Calibri"/>
+          <w:b/>
+          <w:color w:val="000000"/>
+          <w:sz w:val="22"/>
+          <w:szCs w:val="24"/>
+        </w:rPr>
+        <w:t>&lt; 1% adversarial evasion</w:t>
+      </w:r>
+      <w:r>
+        <w:rPr>
+          <w:rFonts w:cs="Calibri"/>
+          <w:color w:val="000000"/>
+          <w:sz w:val="22"/>
+          <w:szCs w:val="24"/>
+        </w:rPr>
+        <w:t xml:space="preserve"> under leet/homoglyph attacks.</w:t>
+      </w:r>
+    </w:p>
+    <w:p>
+      <w:pPr>
+        <w:spacing w:after="10" w:line="240" w:lineRule="auto"/>
+        <w:ind w:left="245" w:hanging="245"/>
+        <w:rPr>
+          <w:rFonts w:cs="Calibri"/>
+          <w:sz w:val="22"/>
+          <w:szCs w:val="24"/>
+        </w:rPr>
+      </w:pPr>
+      <w:r>
+        <w:rPr>
+          <w:rFonts w:cs="Calibri"/>
+          <w:color w:val="000000"/>
+          <w:sz w:val="22"/>
+          <w:szCs w:val="24"/>
+        </w:rPr>
+        <w:t xml:space="preserve">•  Dockerized REST API with 100% test coverage and CI/CD via GitHub Actions; live on Render + </w:t>
+      </w:r>
+      <w:r>
+        <w:rPr>
+          <w:rFonts w:cs="Calibri"/>
+          <w:color w:val="000000"/>
+          <w:sz w:val="22"/>
+          <w:szCs w:val="24"/>
+        </w:rPr>
+        <w:t>Vercel</w:t>
+      </w:r>
+      <w:r>
+        <w:rPr>
+          <w:rFonts w:cs="Calibri"/>
+          <w:color w:val="000000"/>
+          <w:sz w:val="22"/>
+          <w:szCs w:val="24"/>
+        </w:rPr>
+        <w:t>.</w:t>
+      </w:r>
+    </w:p>
+    <w:p>
+      <w:pPr>
+        <w:spacing w:before="50" w:after="20" w:line="240" w:lineRule="auto"/>
+        <w:rPr>
+          <w:rFonts w:cs="Calibri"/>
+          <w:sz w:val="22"/>
+          <w:szCs w:val="24"/>
+        </w:rPr>
+      </w:pPr>
+      <w:r>
+        <w:rPr>
+          <w:rFonts w:cs="Calibri"/>
+          <w:b/>
+          <w:color w:val="000000"/>
+          <w:sz w:val="22"/>
+          <w:szCs w:val="24"/>
+        </w:rPr>
+        <w:t>QueryDocs — RAG Document Q&amp;A Assistant</w:t>
+      </w:r>
+    </w:p>
+    <w:p>
+      <w:pPr>
+        <w:spacing w:after="10" w:line="240" w:lineRule="auto"/>
+        <w:ind w:left="245" w:hanging="245"/>
+        <w:rPr>
+          <w:rFonts w:cs="Calibri"/>
+          <w:sz w:val="22"/>
+          <w:szCs w:val="24"/>
+        </w:rPr>
+      </w:pPr>
+      <w:r>
+        <w:rPr>
+          <w:rFonts w:cs="Calibri"/>
+          <w:color w:val="000000"/>
+          <w:sz w:val="22"/>
+          <w:szCs w:val="24"/>
+        </w:rPr>
+        <w:t>•  Chunking, FAISS semantic retrieval over a persisted index, answer synthesis with source citations.</w:t>
+      </w:r>
+    </w:p>
+    <w:p>
+      <w:pPr>
+        <w:spacing w:after="10" w:line="240" w:lineRule="auto"/>
+        <w:ind w:left="245" w:hanging="245"/>
+        <w:rPr>
+          <w:rFonts w:cs="Calibri"/>
+          <w:sz w:val="22"/>
+          <w:szCs w:val="24"/>
+        </w:rPr>
+      </w:pPr>
+      <w:r>
+        <w:rPr>
+          <w:rFonts w:cs="Calibri"/>
+          <w:color w:val="000000"/>
+          <w:sz w:val="22"/>
+          <w:szCs w:val="24"/>
+        </w:rPr>
+        <w:t>•  Zero-API-key extractive mode for offline use; optional Groq/OpenAI integration; Next.js frontend.</w:t>
+      </w:r>
+    </w:p>
+    <w:p>
+      <w:pPr>
+        <w:spacing w:before="50" w:after="20" w:line="240" w:lineRule="auto"/>
+        <w:rPr>
+          <w:rFonts w:cs="Calibri"/>
+          <w:sz w:val="22"/>
+          <w:szCs w:val="24"/>
+        </w:rPr>
+      </w:pPr>
+      <w:r>
+        <w:rPr>
+          <w:rFonts w:cs="Calibri"/>
+          <w:b/>
+          <w:color w:val="000000"/>
+          <w:sz w:val="22"/>
+          <w:szCs w:val="24"/>
+        </w:rPr>
+        <w:t>AI Essay Detector — Evidence-Based AI-Writing Analysis</w:t>
+      </w:r>
+    </w:p>
+    <w:p>
+      <w:pPr>
+        <w:spacing w:after="10" w:line="240" w:lineRule="auto"/>
+        <w:ind w:left="245" w:hanging="245"/>
+        <w:rPr>
+          <w:rFonts w:cs="Calibri"/>
+          <w:sz w:val="22"/>
+          <w:szCs w:val="24"/>
+        </w:rPr>
+      </w:pPr>
+      <w:r>
+        <w:rPr>
+          <w:rFonts w:cs="Calibri"/>
+          <w:color w:val="000000"/>
+          <w:sz w:val="22"/>
+          <w:szCs w:val="24"/>
+        </w:rPr>
+        <w:t xml:space="preserve">•  Statistical sentence-level signals (perplexity, entropy) z-scored against a </w:t>
+      </w:r>
+      <w:r>
+        <w:rPr>
+          <w:rFonts w:cs="Calibri"/>
+          <w:b/>
+          <w:color w:val="000000"/>
+          <w:sz w:val="22"/>
+          <w:szCs w:val="24"/>
+        </w:rPr>
+        <w:t>6K-essay human baseline</w:t>
+      </w:r>
+      <w:r>
+        <w:rPr>
+          <w:rFonts w:cs="Calibri"/>
+          <w:color w:val="000000"/>
+          <w:sz w:val="22"/>
+          <w:szCs w:val="24"/>
+        </w:rPr>
+        <w:t>.</w:t>
+      </w:r>
+    </w:p>
+    <w:p>
+      <w:pPr>
+        <w:spacing w:after="10" w:line="240" w:lineRule="auto"/>
+        <w:ind w:left="245" w:hanging="245"/>
+        <w:rPr>
+          <w:rFonts w:cs="Calibri"/>
+          <w:sz w:val="22"/>
+          <w:szCs w:val="24"/>
+        </w:rPr>
+      </w:pPr>
+      <w:r>
+        <w:rPr>
+          <w:rFonts w:cs="Calibri"/>
+          <w:color w:val="000000"/>
+          <w:sz w:val="22"/>
+          <w:szCs w:val="24"/>
+        </w:rPr>
+        <w:t xml:space="preserve">•  Per-sentence evidence tables; </w:t>
+      </w:r>
+      <w:r>
+        <w:rPr>
+          <w:rFonts w:cs="Calibri"/>
+          <w:b/>
+          <w:color w:val="000000"/>
+          <w:sz w:val="22"/>
+          <w:szCs w:val="24"/>
+        </w:rPr>
+        <w:t>200+ automated tests</w:t>
+      </w:r>
+      <w:r>
+        <w:rPr>
+          <w:rFonts w:cs="Calibri"/>
+          <w:color w:val="000000"/>
+          <w:sz w:val="22"/>
+          <w:szCs w:val="24"/>
+        </w:rPr>
+        <w:t>; ruff + mypy clean.</w:t>
+      </w:r>
+    </w:p>
+    <w:p>
+      <w:pPr>
+        <w:spacing w:before="50" w:after="20" w:line="240" w:lineRule="auto"/>
+        <w:rPr>
+          <w:rFonts w:cs="Calibri"/>
+          <w:sz w:val="22"/>
+          <w:szCs w:val="24"/>
+        </w:rPr>
+      </w:pPr>
+      <w:r>
+        <w:rPr>
+          <w:rFonts w:cs="Calibri"/>
+          <w:b/>
+          <w:color w:val="000000"/>
+          <w:sz w:val="22"/>
+          <w:szCs w:val="24"/>
+        </w:rPr>
+        <w:t>Infrastructure &amp; Security Engineering — Virtualization, Networking &amp; SecOps</w:t>
+      </w:r>
+    </w:p>
+    <w:p>
+      <w:pPr>
+        <w:spacing w:after="10" w:line="240" w:lineRule="auto"/>
+        <w:ind w:left="245" w:hanging="245"/>
+        <w:rPr>
+          <w:rFonts w:cs="Calibri"/>
+          <w:sz w:val="22"/>
+          <w:szCs w:val="24"/>
+        </w:rPr>
+      </w:pPr>
+      <w:r>
+        <w:rPr>
+          <w:rFonts w:cs="Calibri"/>
+          <w:color w:val="000000"/>
+          <w:sz w:val="22"/>
+          <w:szCs w:val="24"/>
+        </w:rPr>
+        <w:t>•  Designed and manage a multi-node Proxmox VE cluster (15+ Ubuntu VMs) with VLAN segmentation, DNS (Pi-hole/Unbound), reverse proxy (Traefik), centralized logging (Loki), and metrics (Prometheus/Grafana).</w:t>
+      </w:r>
+    </w:p>
+    <w:p>
+      <w:pPr>
+        <w:spacing w:after="10" w:line="240" w:lineRule="auto"/>
+        <w:ind w:left="245" w:hanging="245"/>
+        <w:rPr>
+          <w:rFonts w:cs="Calibri"/>
+          <w:sz w:val="22"/>
+          <w:szCs w:val="24"/>
+        </w:rPr>
+      </w:pPr>
+      <w:r>
+        <w:rPr>
+          <w:rFonts w:cs="Calibri"/>
+          <w:color w:val="000000"/>
+          <w:sz w:val="22"/>
+          <w:szCs w:val="24"/>
+        </w:rPr>
+        <w:t>•  Implemented hardening baseline: fail2ban, nftables, SSH-key-only access, auditd, unattended-upgrades; Lynis compliance scoring.</w:t>
+      </w:r>
+    </w:p>
+    <w:p>
+      <w:pPr>
+        <w:spacing w:after="10" w:line="240" w:lineRule="auto"/>
+        <w:ind w:left="245" w:hanging="245"/>
+        <w:rPr>
+          <w:rFonts w:cs="Calibri"/>
+          <w:sz w:val="22"/>
+          <w:szCs w:val="24"/>
+        </w:rPr>
+      </w:pPr>
+      <w:r>
+        <w:rPr>
+          <w:rFonts w:cs="Calibri"/>
+          <w:color w:val="000000"/>
+          <w:sz w:val="22"/>
+          <w:szCs w:val="24"/>
+        </w:rPr>
+        <w:t>•  Built vulnerability management pipeline: scheduled OpenVAS/Trivy scans, CVE triage workflow, and Sigma rule validation for detection engineering.</w:t>
+      </w:r>
+    </w:p>
+    <w:p>
+      <w:pPr>
+        <w:spacing w:after="10" w:line="240" w:lineRule="auto"/>
+        <w:ind w:left="245" w:hanging="245"/>
+        <w:rPr>
+          <w:rFonts w:cs="Calibri"/>
+          <w:sz w:val="22"/>
+          <w:szCs w:val="24"/>
+        </w:rPr>
+      </w:pPr>
+      <w:r>
+        <w:rPr>
+          <w:rFonts w:cs="Calibri"/>
+          <w:color w:val="000000"/>
+          <w:sz w:val="22"/>
+          <w:szCs w:val="24"/>
+        </w:rPr>
+        <w:t>•  Active Directory security lab: Kerberos delegation auditing, Kerberoasting/AS-REP roasting, BloodHound attack-path analysis, and MITRE ATT&amp;CK-mapped detection rule authoring.</w:t>
+      </w:r>
+    </w:p>
+    <w:p>
+      <w:pPr>
+        <w:pBdr>
+          <w:bottom w:val="single" w:sz="8" w:space="2" w:color="1F4E79"/>
+        </w:pBdr>
+        <w:spacing w:before="80" w:after="40" w:line="240" w:lineRule="auto"/>
+        <w:rPr>
+          <w:rFonts w:cs="Calibri"/>
+          <w:sz w:val="22"/>
+          <w:szCs w:val="24"/>
+        </w:rPr>
+      </w:pPr>
+      <w:r>
+        <w:rPr>
+          <w:rFonts w:cs="Calibri"/>
+          <w:b/>
+          <w:color w:val="1F4E79"/>
+          <w:sz w:val="24"/>
+          <w:szCs w:val="24"/>
+        </w:rPr>
+        <w:t>CERTIFICATIONS</w:t>
+      </w:r>
+    </w:p>
+    <w:p>
+      <w:pPr>
+        <w:spacing w:after="10" w:line="240" w:lineRule="auto"/>
+        <w:ind w:left="245" w:hanging="245"/>
+        <w:rPr>
+          <w:rFonts w:cs="Calibri"/>
+          <w:sz w:val="22"/>
+          <w:szCs w:val="24"/>
+        </w:rPr>
+      </w:pPr>
+      <w:r>
+        <w:rPr>
+          <w:rFonts w:cs="Calibri"/>
+          <w:color w:val="000000"/>
+          <w:sz w:val="22"/>
+          <w:szCs w:val="24"/>
+        </w:rPr>
+        <w:t>•  CS50: Introduction to Computer Science — Harvard University (edX)</w:t>
+      </w:r>
+    </w:p>
+    <w:p>
+      <w:pPr>
+        <w:spacing w:after="10" w:line="240" w:lineRule="auto"/>
+        <w:ind w:left="245" w:hanging="245"/>
+        <w:rPr>
+          <w:rFonts w:cs="Calibri"/>
+          <w:sz w:val="22"/>
+          <w:szCs w:val="24"/>
+        </w:rPr>
+      </w:pPr>
+      <w:r>
+        <w:rPr>
+          <w:rFonts w:cs="Calibri"/>
+          <w:color w:val="000000"/>
+          <w:sz w:val="22"/>
+          <w:szCs w:val="24"/>
+        </w:rPr>
+        <w:t>•  Python for Data Science — NPTEL</w:t>
+      </w:r>
+    </w:p>
+    <w:p>
+      <w:pPr>
+        <w:spacing w:after="10" w:line="240" w:lineRule="auto"/>
+        <w:ind w:left="245" w:hanging="245"/>
+        <w:rPr>
+          <w:rFonts w:cs="Calibri"/>
+          <w:color w:val="000000"/>
+          <w:sz w:val="22"/>
+          <w:szCs w:val="24"/>
+        </w:rPr>
+      </w:pPr>
+      <w:r>
+        <w:rPr>
+          <w:rFonts w:cs="Calibri"/>
+          <w:color w:val="000000"/>
+          <w:sz w:val="22"/>
+          <w:szCs w:val="24"/>
+        </w:rPr>
+        <w:t>•  Demystifying Networking — IIT Bombay</w:t>
+      </w:r>
+    </w:p>
+    <w:p>
+      <w:pPr>
+        <w:spacing w:after="10" w:line="240" w:lineRule="auto"/>
+        <w:ind w:left="245" w:hanging="245"/>
+        <w:rPr>
+          <w:rFonts w:cs="Calibri"/>
+          <w:sz w:val="22"/>
+          <w:szCs w:val="24"/>
+        </w:rPr>
+      </w:pPr>
+      <w:r>
+        <w:rPr>
+          <w:rFonts w:cs="Calibri"/>
+          <w:color w:val="000000"/>
+          <w:sz w:val="22"/>
+          <w:szCs w:val="24"/>
+        </w:rPr>
+        <w:t xml:space="preserve">• </w:t>
+      </w:r>
+      <w:r>
+        <w:rPr>
+          <w:rFonts w:cs="Calibri"/>
+          <w:sz w:val="22"/>
+          <w:szCs w:val="24"/>
+        </w:rPr>
+        <w:t xml:space="preserve">Machine Learning Crash Course </w:t>
+      </w:r>
+      <w:r>
+        <w:rPr>
+          <w:rFonts w:cs="Calibri"/>
+          <w:sz w:val="22"/>
+          <w:szCs w:val="24"/>
+        </w:rPr>
+        <w:t>–</w:t>
+      </w:r>
+      <w:r>
+        <w:rPr>
+          <w:rFonts w:cs="Calibri"/>
+          <w:sz w:val="22"/>
+          <w:szCs w:val="24"/>
+        </w:rPr>
+        <w:t xml:space="preserve"> Google</w:t>
+      </w:r>
+    </w:p>
+    <w:p>
+      <w:pPr>
+        <w:spacing w:after="10" w:line="240" w:lineRule="auto"/>
+        <w:ind w:left="245" w:hanging="245"/>
+        <w:rPr>
+          <w:rFonts w:cs="Calibri"/>
+          <w:sz w:val="22"/>
+          <w:szCs w:val="24"/>
+        </w:rPr>
+      </w:pPr>
+      <w:r>
+        <w:rPr>
+          <w:rFonts w:cs="Calibri"/>
+          <w:color w:val="000000"/>
+          <w:sz w:val="22"/>
+          <w:szCs w:val="24"/>
+        </w:rPr>
+        <w:t xml:space="preserve">• </w:t>
+      </w:r>
+      <w:r>
+        <w:rPr>
+          <w:rFonts w:cs="Calibri"/>
+          <w:sz w:val="22"/>
+          <w:szCs w:val="24"/>
+        </w:rPr>
+        <w:t>ChatGPT Prompt Engineering for Developers - DeepLearning.AI</w:t>
+      </w:r>
+    </w:p>
+    <w:p>
+      <w:pPr>
+        <w:pBdr>
+          <w:bottom w:val="single" w:sz="8" w:space="2" w:color="1F4E79"/>
+        </w:pBdr>
+        <w:spacing w:before="80" w:after="40" w:line="240" w:lineRule="auto"/>
+        <w:rPr>
+          <w:rFonts w:cs="Calibri"/>
+          <w:sz w:val="22"/>
+          <w:szCs w:val="24"/>
+        </w:rPr>
+      </w:pPr>
+      <w:r>
+        <w:rPr>
+          <w:rFonts w:cs="Calibri"/>
+          <w:b/>
+          <w:color w:val="1F4E79"/>
+          <w:sz w:val="24"/>
+          <w:szCs w:val="24"/>
         </w:rPr>
         <w:t>EDUCATION</w:t>
       </w:r>
@@ -95,21 +983,32 @@
         <w:tabs>
           <w:tab w:val="right" w:pos="9893"/>
         </w:tabs>
-        <w:spacing w:before="60" w:after="20" w:line="240" w:lineRule="auto"/>
+        <w:spacing w:before="50" w:after="20" w:line="240" w:lineRule="auto"/>
+        <w:rPr>
+          <w:rFonts w:cs="Calibri"/>
+          <w:b/>
+          <w:color w:val="000000"/>
+          <w:sz w:val="22"/>
+          <w:szCs w:val="24"/>
+        </w:rPr>
       </w:pPr>
       <w:r>
         <w:rPr>
           <w:rFonts w:cs="Calibri"/>
           <w:b/>
           <w:color w:val="000000"/>
+          <w:sz w:val="22"/>
+          <w:szCs w:val="24"/>
         </w:rPr>
-        <w:t>Bachelor of Technology (B.Tech.) in Computer Science &amp; Engineering (IoT)</w:t>
+        <w:t>B.Tech., Computer Science &amp; Engineering (IoT) — Amity University, Noida</w:t>
       </w:r>
       <w:r>
         <w:rPr>
           <w:rFonts w:cs="Calibri"/>
           <w:b/>
           <w:color w:val="444444"/>
+          <w:sz w:val="22"/>
+          <w:szCs w:val="24"/>
         </w:rPr>
         <w:tab/>
         <w:t>2023 – 2027</w:t>
@@ -118,15 +1017,21 @@
     <w:p>
       <w:pPr>
         <w:spacing w:after="20" w:line="240" w:lineRule="auto"/>
+        <w:jc w:val="right"/>
+        <w:rPr>
+          <w:rFonts w:cs="Calibri"/>
+          <w:sz w:val="22"/>
+          <w:szCs w:val="24"/>
+        </w:rPr>
       </w:pPr>
       <w:r>
         <w:rPr>
           <w:rFonts w:cs="Calibri"/>
           <w:i/>
           <w:color w:val="444444"/>
-          <w:sz w:val="18"/>
+          <w:szCs w:val="24"/>
         </w:rPr>
-        <w:t>Amity University, Noida</w:t>
+        <w:t>CGPA: 7.29/10</w:t>
       </w:r>
     </w:p>
     <w:p>
@@ -134,46 +1039,33 @@
         <w:tabs>
           <w:tab w:val="right" w:pos="9893"/>
         </w:tabs>
-        <w:spacing w:before="60" w:after="20" w:line="240" w:lineRule="auto"/>
+        <w:spacing w:before="50" w:after="20" w:line="240" w:lineRule="auto"/>
+        <w:rPr>
+          <w:rFonts w:cs="Calibri"/>
+          <w:sz w:val="22"/>
+          <w:szCs w:val="24"/>
+        </w:rPr>
       </w:pPr>
       <w:r>
         <w:rPr>
           <w:rFonts w:cs="Calibri"/>
           <w:b/>
           <w:color w:val="000000"/>
+          <w:sz w:val="22"/>
+          <w:szCs w:val="24"/>
         </w:rPr>
-        <w:t>Senior Secondary (Class XII, CBSE)</w:t>
+        <w:t>Senior Secondary (Class XII, CBSE) — Salwan Public School, Delhi</w:t>
       </w:r>
       <w:r>
         <w:rPr>
           <w:rFonts w:cs="Calibri"/>
           <w:b/>
           <w:color w:val="444444"/>
+          <w:sz w:val="22"/>
+          <w:szCs w:val="24"/>
         </w:rPr>
         <w:tab/>
-        <w:t>202</w:t>
-      </w:r>
-      <w:r>
-        <w:rPr>
-          <w:rFonts w:cs="Calibri"/>
-          <w:b/>
-          <w:color w:val="444444"/>
-        </w:rPr>
-        <w:t>2</w:t>
-      </w:r>
-    </w:p>
-    <w:p>
-      <w:pPr>
-        <w:spacing w:after="20" w:line="240" w:lineRule="auto"/>
-      </w:pPr>
-      <w:r>
-        <w:rPr>
-          <w:rFonts w:cs="Calibri"/>
-          <w:i/>
-          <w:color w:val="444444"/>
-          <w:sz w:val="18"/>
-        </w:rPr>
-        <w:t>Salwan Public School, Delhi</w:t>
+        <w:t>2022</w:t>
       </w:r>
     </w:p>
     <w:p>
@@ -181,46 +1073,33 @@
         <w:tabs>
           <w:tab w:val="right" w:pos="9893"/>
         </w:tabs>
-        <w:spacing w:before="60" w:after="20" w:line="240" w:lineRule="auto"/>
+        <w:spacing w:before="50" w:after="20" w:line="240" w:lineRule="auto"/>
+        <w:rPr>
+          <w:rFonts w:cs="Calibri"/>
+          <w:sz w:val="22"/>
+          <w:szCs w:val="24"/>
+        </w:rPr>
       </w:pPr>
       <w:r>
         <w:rPr>
           <w:rFonts w:cs="Calibri"/>
           <w:b/>
           <w:color w:val="000000"/>
+          <w:sz w:val="22"/>
+          <w:szCs w:val="24"/>
         </w:rPr>
-        <w:t>Secondary (Class X, CBSE)</w:t>
+        <w:t>Secondary (Class X, CBSE) — Millennium School, Noida</w:t>
       </w:r>
       <w:r>
         <w:rPr>
           <w:rFonts w:cs="Calibri"/>
           <w:b/>
           <w:color w:val="444444"/>
+          <w:sz w:val="22"/>
+          <w:szCs w:val="24"/>
         </w:rPr>
         <w:tab/>
-        <w:t>202</w:t>
-      </w:r>
-      <w:r>
-        <w:rPr>
-          <w:rFonts w:cs="Calibri"/>
-          <w:b/>
-          <w:color w:val="444444"/>
-        </w:rPr>
-        <w:t>0</w:t>
-      </w:r>
-    </w:p>
-    <w:p>
-      <w:pPr>
-        <w:spacing w:after="20" w:line="240" w:lineRule="auto"/>
-      </w:pPr>
-      <w:r>
-        <w:rPr>
-          <w:rFonts w:cs="Calibri"/>
-          <w:i/>
-          <w:color w:val="444444"/>
-          <w:sz w:val="18"/>
-        </w:rPr>
-        <w:t>Millennium School, Noida</w:t>
+        <w:t>2020</w:t>
       </w:r>
     </w:p>
     <w:p>
@@ -228,611 +1107,20 @@
         <w:pBdr>
           <w:bottom w:val="single" w:sz="8" w:space="2" w:color="1F4E79"/>
         </w:pBdr>
-        <w:spacing w:before="100" w:after="60" w:line="240" w:lineRule="auto"/>
+        <w:spacing w:before="80" w:after="40" w:line="240" w:lineRule="auto"/>
+        <w:rPr>
+          <w:rFonts w:cs="Calibri"/>
+          <w:sz w:val="22"/>
+          <w:szCs w:val="24"/>
+        </w:rPr>
       </w:pPr>
       <w:r>
         <w:rPr>
           <w:rFonts w:cs="Calibri"/>
           <w:b/>
           <w:color w:val="1F4E79"/>
-          <w:sz w:val="22"/>
-        </w:rPr>
-        <w:t>EXPERIENCE</w:t>
-      </w:r>
-    </w:p>
-    <w:p>
-      <w:pPr>
-        <w:tabs>
-          <w:tab w:val="right" w:pos="9893"/>
-        </w:tabs>
-        <w:spacing w:before="60" w:after="20" w:line="240" w:lineRule="auto"/>
-      </w:pPr>
-      <w:r>
-        <w:rPr>
-          <w:rFonts w:cs="Calibri"/>
-          <w:b/>
-          <w:color w:val="000000"/>
-        </w:rPr>
-        <w:t>Artificial Intelligence Intern</w:t>
-      </w:r>
-      <w:r>
-        <w:rPr>
-          <w:rFonts w:cs="Calibri"/>
-          <w:b/>
-          <w:color w:val="444444"/>
-        </w:rPr>
-        <w:tab/>
-        <w:t>May 2026 – Jul 2026</w:t>
-      </w:r>
-    </w:p>
-    <w:p>
-      <w:pPr>
-        <w:spacing w:after="20" w:line="240" w:lineRule="auto"/>
-      </w:pPr>
-      <w:r>
-        <w:rPr>
-          <w:rFonts w:cs="Calibri"/>
-          <w:i/>
-          <w:color w:val="444444"/>
-          <w:sz w:val="18"/>
-        </w:rPr>
-        <w:t>Syphyr Pvt. Ltd.</w:t>
-      </w:r>
-    </w:p>
-    <w:p>
-      <w:pPr>
-        <w:spacing w:after="20" w:line="240" w:lineRule="auto"/>
-        <w:ind w:left="245" w:hanging="245"/>
-      </w:pPr>
-      <w:r>
-        <w:rPr>
-          <w:rFonts w:cs="Calibri"/>
-          <w:color w:val="000000"/>
-        </w:rPr>
-        <w:t>•  Built proof-of-concept AI applications in Python using modern AI/ML tooling.</w:t>
-      </w:r>
-    </w:p>
-    <w:p>
-      <w:pPr>
-        <w:spacing w:after="20" w:line="240" w:lineRule="auto"/>
-        <w:ind w:left="245" w:hanging="245"/>
-      </w:pPr>
-      <w:r>
-        <w:rPr>
-          <w:rFonts w:cs="Calibri"/>
-          <w:color w:val="000000"/>
-        </w:rPr>
-        <w:t>•  Assisted in model training, testing, and performance evaluation for client projects.</w:t>
-      </w:r>
-    </w:p>
-    <w:p>
-      <w:pPr>
-        <w:spacing w:after="20" w:line="240" w:lineRule="auto"/>
-        <w:ind w:left="245" w:hanging="245"/>
-      </w:pPr>
-      <w:r>
-        <w:rPr>
-          <w:rFonts w:cs="Calibri"/>
-          <w:color w:val="000000"/>
-        </w:rPr>
-        <w:t>•  Participated in project discussions, debugging, and solution development.</w:t>
-      </w:r>
-    </w:p>
-    <w:p>
-      <w:pPr>
-        <w:pBdr>
-          <w:bottom w:val="single" w:sz="8" w:space="2" w:color="1F4E79"/>
-        </w:pBdr>
-        <w:spacing w:before="100" w:after="60" w:line="240" w:lineRule="auto"/>
-      </w:pPr>
-      <w:r>
-        <w:rPr>
-          <w:rFonts w:cs="Calibri"/>
-          <w:b/>
-          <w:color w:val="1F4E79"/>
-          <w:sz w:val="22"/>
-        </w:rPr>
-        <w:t>PROJECTS</w:t>
-      </w:r>
-    </w:p>
-    <w:p>
-      <w:pPr>
-        <w:tabs>
-          <w:tab w:val="right" w:pos="9893"/>
-        </w:tabs>
-        <w:spacing w:before="60" w:after="20" w:line="240" w:lineRule="auto"/>
-      </w:pPr>
-      <w:r>
-        <w:rPr>
-          <w:rFonts w:cs="Calibri"/>
-          <w:b/>
-          <w:color w:val="000000"/>
-        </w:rPr>
-        <w:t>PhishGuard — AI-Powered Phishing URL Detection</w:t>
-      </w:r>
-      <w:r>
-        <w:rPr>
-          <w:rFonts w:cs="Calibri"/>
-          <w:b/>
-          <w:color w:val="444444"/>
-        </w:rPr>
-        <w:tab/>
-      </w:r>
-    </w:p>
-    <w:p>
-      <w:pPr>
-        <w:spacing w:after="20" w:line="240" w:lineRule="auto"/>
-      </w:pPr>
-      <w:r>
-        <w:rPr>
-          <w:rFonts w:cs="Calibri"/>
-          <w:i/>
-          <w:color w:val="444444"/>
-          <w:sz w:val="18"/>
-        </w:rPr>
-        <w:t>Python | XGBoost | SHAP | scikit-learn | FastAPI | Docker | GitHub Actions</w:t>
-      </w:r>
-    </w:p>
-    <w:p>
-      <w:pPr>
-        <w:tabs>
-          <w:tab w:val="right" w:pos="9893"/>
-        </w:tabs>
-        <w:spacing w:after="20" w:line="240" w:lineRule="auto"/>
-      </w:pPr>
-      <w:r>
-        <w:rPr>
-          <w:rFonts w:cs="Calibri"/>
-          <w:i/>
-          <w:color w:val="444444"/>
-          <w:sz w:val="18"/>
-        </w:rPr>
-        <w:t>Deployed, live web app with REST API</w:t>
-      </w:r>
-      <w:r>
-        <w:rPr>
-          <w:rFonts w:cs="Calibri"/>
-          <w:i/>
-          <w:color w:val="444444"/>
-          <w:sz w:val="18"/>
-        </w:rPr>
-        <w:tab/>
-        <w:t>[</w:t>
-      </w:r>
-      <w:hyperlink r:id="rId8">
-        <w:r>
-          <w:rPr>
-            <w:color w:val="1F4E79"/>
-            <w:sz w:val="18"/>
-            <w:u w:val="single"/>
-          </w:rPr>
-          <w:t>Live demo</w:t>
-        </w:r>
-      </w:hyperlink>
-      <w:r>
-        <w:rPr>
-          <w:rFonts w:cs="Calibri"/>
-          <w:color w:val="444444"/>
-          <w:sz w:val="18"/>
-        </w:rPr>
-        <w:t xml:space="preserve">  </w:t>
-      </w:r>
-      <w:hyperlink r:id="rId9">
-        <w:r>
-          <w:rPr>
-            <w:color w:val="1F4E79"/>
-            <w:sz w:val="18"/>
-            <w:u w:val="single"/>
-          </w:rPr>
-          <w:t>GitHub</w:t>
-        </w:r>
-      </w:hyperlink>
-      <w:r>
-        <w:rPr>
-          <w:rFonts w:cs="Calibri"/>
-          <w:i/>
-          <w:color w:val="444444"/>
-          <w:sz w:val="18"/>
-        </w:rPr>
-        <w:t>]</w:t>
-      </w:r>
-    </w:p>
-    <w:p>
-      <w:pPr>
-        <w:spacing w:after="20" w:line="240" w:lineRule="auto"/>
-        <w:ind w:left="245" w:hanging="245"/>
-      </w:pPr>
-      <w:r>
-        <w:rPr>
-          <w:rFonts w:cs="Calibri"/>
-          <w:color w:val="000000"/>
-        </w:rPr>
-        <w:t xml:space="preserve">•  Trained an XGBoost classifier on a 468K-URL dataset — </w:t>
-      </w:r>
-      <w:r>
-        <w:rPr>
-          <w:rFonts w:cs="Calibri"/>
-          <w:b/>
-          <w:color w:val="000000"/>
-        </w:rPr>
-        <w:t>0.9973 F1, 0.9994 AUC</w:t>
-      </w:r>
-      <w:r>
-        <w:rPr>
-          <w:rFonts w:cs="Calibri"/>
-          <w:color w:val="000000"/>
-        </w:rPr>
-        <w:t>, with 33 hand-crafted lexical/structural features.</w:t>
-      </w:r>
-    </w:p>
-    <w:p>
-      <w:pPr>
-        <w:spacing w:after="20" w:line="240" w:lineRule="auto"/>
-        <w:ind w:left="245" w:hanging="245"/>
-      </w:pPr>
-      <w:r>
-        <w:rPr>
-          <w:rFonts w:cs="Calibri"/>
-          <w:color w:val="000000"/>
-        </w:rPr>
-        <w:t xml:space="preserve">•  Explains every prediction with SHAP values and calibrated confidence (isotonic regression); </w:t>
-      </w:r>
-      <w:r>
-        <w:rPr>
-          <w:rFonts w:cs="Calibri"/>
-          <w:b/>
-          <w:color w:val="000000"/>
-        </w:rPr>
-        <w:t>adversarial evasion &lt; 1%</w:t>
-      </w:r>
-      <w:r>
-        <w:rPr>
-          <w:rFonts w:cs="Calibri"/>
-          <w:color w:val="000000"/>
-        </w:rPr>
-        <w:t xml:space="preserve"> under leet, homoglyph, and encoding attacks.</w:t>
-      </w:r>
-    </w:p>
-    <w:p>
-      <w:pPr>
-        <w:spacing w:after="20" w:line="240" w:lineRule="auto"/>
-        <w:ind w:left="245" w:hanging="245"/>
-      </w:pPr>
-      <w:r>
-        <w:rPr>
-          <w:rFonts w:cs="Calibri"/>
-          <w:color w:val="000000"/>
-        </w:rPr>
-        <w:t>•  Containerized with Docker; 100% test coverage; CI/CD via GitHub Actions; deployed on GitHub Pages + Render.</w:t>
-      </w:r>
-    </w:p>
-    <w:p>
-      <w:pPr>
-        <w:tabs>
-          <w:tab w:val="right" w:pos="9893"/>
-        </w:tabs>
-        <w:spacing w:before="60" w:after="20" w:line="240" w:lineRule="auto"/>
-      </w:pPr>
-      <w:r>
-        <w:rPr>
-          <w:rFonts w:cs="Calibri"/>
-          <w:b/>
-          <w:color w:val="000000"/>
-        </w:rPr>
-        <w:t>QueryDocs — RAG Document Q&amp;A Assistant</w:t>
-      </w:r>
-      <w:r>
-        <w:rPr>
-          <w:rFonts w:cs="Calibri"/>
-          <w:b/>
-          <w:color w:val="444444"/>
-        </w:rPr>
-        <w:tab/>
-      </w:r>
-    </w:p>
-    <w:p>
-      <w:pPr>
-        <w:spacing w:after="20" w:line="240" w:lineRule="auto"/>
-      </w:pPr>
-      <w:r>
-        <w:rPr>
-          <w:rFonts w:cs="Calibri"/>
-          <w:i/>
-          <w:color w:val="444444"/>
-          <w:sz w:val="18"/>
-        </w:rPr>
-        <w:t>Python | FastAPI | FAISS | sentence-transformers | Next.js 15</w:t>
-      </w:r>
-    </w:p>
-    <w:p>
-      <w:pPr>
-        <w:tabs>
-          <w:tab w:val="right" w:pos="9893"/>
-        </w:tabs>
-        <w:spacing w:after="20" w:line="240" w:lineRule="auto"/>
-      </w:pPr>
-      <w:r>
-        <w:rPr>
-          <w:rFonts w:cs="Calibri"/>
-          <w:i/>
-          <w:color w:val="444444"/>
-          <w:sz w:val="18"/>
-        </w:rPr>
-        <w:t>Upload PDF/TXT/MD/DOCX, ask grounded questions</w:t>
-      </w:r>
-      <w:r>
-        <w:rPr>
-          <w:rFonts w:cs="Calibri"/>
-          <w:i/>
-          <w:color w:val="444444"/>
-          <w:sz w:val="18"/>
-        </w:rPr>
-        <w:tab/>
-        <w:t>[</w:t>
-      </w:r>
-      <w:hyperlink r:id="rId10">
-        <w:r>
-          <w:rPr>
-            <w:color w:val="1F4E79"/>
-            <w:sz w:val="18"/>
-            <w:u w:val="single"/>
-          </w:rPr>
-          <w:t>GitHub</w:t>
-        </w:r>
-      </w:hyperlink>
-      <w:r>
-        <w:rPr>
-          <w:rFonts w:cs="Calibri"/>
-          <w:i/>
-          <w:color w:val="444444"/>
-          <w:sz w:val="18"/>
-        </w:rPr>
-        <w:t>]</w:t>
-      </w:r>
-    </w:p>
-    <w:p>
-      <w:pPr>
-        <w:spacing w:after="20" w:line="240" w:lineRule="auto"/>
-        <w:ind w:left="245" w:hanging="245"/>
-      </w:pPr>
-      <w:r>
-        <w:rPr>
-          <w:rFonts w:cs="Calibri"/>
-          <w:color w:val="000000"/>
-        </w:rPr>
-        <w:t>•  Implemented document chunking, embedding-based semantic retrieval over a persisted FAISS index, and context-aware answer synthesis with source citations.</w:t>
-      </w:r>
-    </w:p>
-    <w:p>
-      <w:pPr>
-        <w:spacing w:after="20" w:line="240" w:lineRule="auto"/>
-        <w:ind w:left="245" w:hanging="245"/>
-      </w:pPr>
-      <w:r>
-        <w:rPr>
-          <w:rFonts w:cs="Calibri"/>
-          <w:color w:val="000000"/>
-        </w:rPr>
-        <w:t>•  Works with zero API keys via an extractive mode; optional Groq/OpenAI integration for natural-language answers; Next.js frontend.</w:t>
-      </w:r>
-    </w:p>
-    <w:p>
-      <w:pPr>
-        <w:tabs>
-          <w:tab w:val="right" w:pos="9893"/>
-        </w:tabs>
-        <w:spacing w:before="60" w:after="20" w:line="240" w:lineRule="auto"/>
-      </w:pPr>
-      <w:r>
-        <w:rPr>
-          <w:rFonts w:cs="Calibri"/>
-          <w:b/>
-          <w:color w:val="000000"/>
-        </w:rPr>
-        <w:t>AI Essay Detector — Evidence-Based AI-Writing Analysis</w:t>
-      </w:r>
-      <w:r>
-        <w:rPr>
-          <w:rFonts w:cs="Calibri"/>
-          <w:b/>
-          <w:color w:val="444444"/>
-        </w:rPr>
-        <w:tab/>
-      </w:r>
-    </w:p>
-    <w:p>
-      <w:pPr>
-        <w:spacing w:after="20" w:line="240" w:lineRule="auto"/>
-      </w:pPr>
-      <w:r>
-        <w:rPr>
-          <w:rFonts w:cs="Calibri"/>
-          <w:i/>
-          <w:color w:val="444444"/>
-          <w:sz w:val="18"/>
-        </w:rPr>
-        <w:t>Python | FastAPI | Next.js 16 | statistical NLP | GPT-2 signal measurement</w:t>
-      </w:r>
-    </w:p>
-    <w:p>
-      <w:pPr>
-        <w:tabs>
-          <w:tab w:val="right" w:pos="9893"/>
-        </w:tabs>
-        <w:spacing w:after="20" w:line="240" w:lineRule="auto"/>
-      </w:pPr>
-      <w:r>
-        <w:rPr>
-          <w:rFonts w:cs="Calibri"/>
-          <w:i/>
-          <w:color w:val="444444"/>
-          <w:sz w:val="18"/>
-        </w:rPr>
-        <w:t>Built for the 2026 i12 HR Drive Hackathon</w:t>
-      </w:r>
-      <w:r>
-        <w:rPr>
-          <w:rFonts w:cs="Calibri"/>
-          <w:i/>
-          <w:color w:val="444444"/>
-          <w:sz w:val="18"/>
-        </w:rPr>
-        <w:tab/>
-        <w:t>[</w:t>
-      </w:r>
-      <w:hyperlink r:id="rId11">
-        <w:r>
-          <w:rPr>
-            <w:color w:val="1F4E79"/>
-            <w:sz w:val="18"/>
-            <w:u w:val="single"/>
-          </w:rPr>
-          <w:t>GitHub</w:t>
-        </w:r>
-      </w:hyperlink>
-      <w:r>
-        <w:rPr>
-          <w:rFonts w:cs="Calibri"/>
-          <w:i/>
-          <w:color w:val="444444"/>
-          <w:sz w:val="18"/>
-        </w:rPr>
-        <w:t>]</w:t>
-      </w:r>
-    </w:p>
-    <w:p>
-      <w:pPr>
-        <w:spacing w:after="20" w:line="240" w:lineRule="auto"/>
-        <w:ind w:left="245" w:hanging="245"/>
-      </w:pPr>
-      <w:r>
-        <w:rPr>
-          <w:rFonts w:cs="Calibri"/>
-          <w:color w:val="000000"/>
-        </w:rPr>
-        <w:t xml:space="preserve">•  Flags machine-like writing using sentence-level statistical signals (perplexity, entropy, token probability) scored as </w:t>
-      </w:r>
-      <w:r>
-        <w:rPr>
-          <w:rFonts w:cs="Calibri"/>
-          <w:b/>
-          <w:color w:val="000000"/>
-        </w:rPr>
-        <w:t>z-scores against 6K-essay human baselines</w:t>
-      </w:r>
-      <w:r>
-        <w:rPr>
-          <w:rFonts w:cs="Calibri"/>
-          <w:color w:val="000000"/>
-        </w:rPr>
-        <w:t xml:space="preserve"> — no binary “AI or not” verdicts.</w:t>
-      </w:r>
-    </w:p>
-    <w:p>
-      <w:pPr>
-        <w:spacing w:after="20" w:line="240" w:lineRule="auto"/>
-        <w:ind w:left="245" w:hanging="245"/>
-      </w:pPr>
-      <w:r>
-        <w:rPr>
-          <w:rFonts w:cs="Calibri"/>
-          <w:color w:val="000000"/>
-        </w:rPr>
-        <w:t xml:space="preserve">•  Full-stack app with per-sentence evidence tables; </w:t>
-      </w:r>
-      <w:r>
-        <w:rPr>
-          <w:rFonts w:cs="Calibri"/>
-          <w:b/>
-          <w:color w:val="000000"/>
-        </w:rPr>
-        <w:t>200+ tests</w:t>
-      </w:r>
-      <w:r>
-        <w:rPr>
-          <w:rFonts w:cs="Calibri"/>
-          <w:color w:val="000000"/>
-        </w:rPr>
-        <w:t>, ruff + mypy clean.</w:t>
-      </w:r>
-    </w:p>
-    <w:p>
-      <w:pPr>
-        <w:tabs>
-          <w:tab w:val="right" w:pos="9893"/>
-        </w:tabs>
-        <w:spacing w:before="60" w:after="20" w:line="240" w:lineRule="auto"/>
-      </w:pPr>
-      <w:r>
-        <w:rPr>
-          <w:rFonts w:cs="Calibri"/>
-          <w:b/>
-          <w:color w:val="000000"/>
-        </w:rPr>
-        <w:t>Personal Homelab &amp; Self-Hosted Infrastructure</w:t>
-      </w:r>
-      <w:r>
-        <w:rPr>
-          <w:rFonts w:cs="Calibri"/>
-          <w:b/>
-          <w:color w:val="444444"/>
-        </w:rPr>
-        <w:tab/>
-      </w:r>
-    </w:p>
-    <w:p>
-      <w:pPr>
-        <w:spacing w:after="20" w:line="240" w:lineRule="auto"/>
-      </w:pPr>
-      <w:r>
-        <w:rPr>
-          <w:rFonts w:cs="Calibri"/>
-          <w:i/>
-          <w:color w:val="444444"/>
-          <w:sz w:val="18"/>
-        </w:rPr>
-        <w:t>Proxmox VE | Ubuntu Server | Docker | Linux | Networking</w:t>
-      </w:r>
-    </w:p>
-    <w:p>
-      <w:pPr>
-        <w:spacing w:after="20" w:line="240" w:lineRule="auto"/>
-        <w:ind w:left="245" w:hanging="245"/>
-      </w:pPr>
-      <w:r>
-        <w:rPr>
-          <w:rFonts w:cs="Calibri"/>
-          <w:color w:val="000000"/>
-        </w:rPr>
-        <w:t>•  Manage a Proxmox VE homelab running Ubuntu Server VMs; configured SSH, networking, and containerized deployments with Docker.</w:t>
-      </w:r>
-    </w:p>
-    <w:p>
-      <w:pPr>
-        <w:spacing w:after="20" w:line="240" w:lineRule="auto"/>
-        <w:ind w:left="245" w:hanging="245"/>
-      </w:pPr>
-      <w:r>
-        <w:rPr>
-          <w:rFonts w:cs="Calibri"/>
-          <w:color w:val="000000"/>
-        </w:rPr>
-        <w:t>•  Self-hosting side-project — hands-on virtualization and Linux administration.</w:t>
-      </w:r>
-    </w:p>
-    <w:p>
-      <w:pPr>
-        <w:pBdr>
-          <w:bottom w:val="single" w:sz="8" w:space="2" w:color="1F4E79"/>
-        </w:pBdr>
-        <w:spacing w:before="100" w:after="60" w:line="240" w:lineRule="auto"/>
-      </w:pPr>
-      <w:r>
-        <w:rPr>
-          <w:rFonts w:cs="Calibri"/>
-          <w:b/>
-          <w:color w:val="1F4E79"/>
-          <w:sz w:val="22"/>
+          <w:sz w:val="24"/>
+          <w:szCs w:val="24"/>
         </w:rPr>
         <w:t>TECHNICAL SKILLS</w:t>
       </w:r>
@@ -840,12 +1128,19 @@
     <w:p>
       <w:pPr>
         <w:spacing w:after="40" w:line="240" w:lineRule="auto"/>
+        <w:rPr>
+          <w:rFonts w:cs="Calibri"/>
+          <w:sz w:val="22"/>
+          <w:szCs w:val="24"/>
+        </w:rPr>
       </w:pPr>
       <w:r>
         <w:rPr>
           <w:rFonts w:cs="Calibri"/>
           <w:b/>
           <w:color w:val="000000"/>
+          <w:sz w:val="22"/>
+          <w:szCs w:val="24"/>
         </w:rPr>
         <w:t xml:space="preserve">Languages: </w:t>
       </w:r>
@@ -853,6 +1148,8 @@
         <w:rPr>
           <w:rFonts w:cs="Calibri"/>
           <w:color w:val="000000"/>
+          <w:sz w:val="22"/>
+          <w:szCs w:val="24"/>
         </w:rPr>
         <w:t>Python, C, C++, JavaScript/TypeScript, SQL</w:t>
       </w:r>
@@ -860,12 +1157,19 @@
     <w:p>
       <w:pPr>
         <w:spacing w:after="40" w:line="240" w:lineRule="auto"/>
+        <w:rPr>
+          <w:rFonts w:cs="Calibri"/>
+          <w:sz w:val="22"/>
+          <w:szCs w:val="24"/>
+        </w:rPr>
       </w:pPr>
       <w:r>
         <w:rPr>
           <w:rFonts w:cs="Calibri"/>
           <w:b/>
           <w:color w:val="000000"/>
+          <w:sz w:val="22"/>
+          <w:szCs w:val="24"/>
         </w:rPr>
         <w:t xml:space="preserve">ML &amp; AI: </w:t>
       </w:r>
@@ -873,6 +1177,8 @@
         <w:rPr>
           <w:rFonts w:cs="Calibri"/>
           <w:color w:val="000000"/>
+          <w:sz w:val="22"/>
+          <w:szCs w:val="24"/>
         </w:rPr>
         <w:t>XGBoost, SHAP, scikit-learn, sentence-transformers, FAISS, RAG, Prompt Engineering</w:t>
       </w:r>
@@ -880,12 +1186,19 @@
     <w:p>
       <w:pPr>
         <w:spacing w:after="40" w:line="240" w:lineRule="auto"/>
+        <w:rPr>
+          <w:rFonts w:cs="Calibri"/>
+          <w:sz w:val="22"/>
+          <w:szCs w:val="24"/>
+        </w:rPr>
       </w:pPr>
       <w:r>
         <w:rPr>
           <w:rFonts w:cs="Calibri"/>
           <w:b/>
           <w:color w:val="000000"/>
+          <w:sz w:val="22"/>
+          <w:szCs w:val="24"/>
         </w:rPr>
         <w:t xml:space="preserve">Backend &amp; Systems: </w:t>
       </w:r>
@@ -893,6 +1206,8 @@
         <w:rPr>
           <w:rFonts w:cs="Calibri"/>
           <w:color w:val="000000"/>
+          <w:sz w:val="22"/>
+          <w:szCs w:val="24"/>
         </w:rPr>
         <w:t>FastAPI, REST APIs, Docker, Linux, Git, GitHub Actions, pytest</w:t>
       </w:r>
@@ -900,12 +1215,19 @@
     <w:p>
       <w:pPr>
         <w:spacing w:after="40" w:line="240" w:lineRule="auto"/>
+        <w:rPr>
+          <w:rFonts w:cs="Calibri"/>
+          <w:sz w:val="22"/>
+          <w:szCs w:val="24"/>
+        </w:rPr>
       </w:pPr>
       <w:r>
         <w:rPr>
           <w:rFonts w:cs="Calibri"/>
           <w:b/>
           <w:color w:val="000000"/>
+          <w:sz w:val="22"/>
+          <w:szCs w:val="24"/>
         </w:rPr>
         <w:t xml:space="preserve">Web: </w:t>
       </w:r>
@@ -913,90 +1235,39 @@
         <w:rPr>
           <w:rFonts w:cs="Calibri"/>
           <w:color w:val="000000"/>
+          <w:sz w:val="22"/>
+          <w:szCs w:val="24"/>
         </w:rPr>
         <w:t>Next.js, React, HTML/CSS/JS</w:t>
       </w:r>
     </w:p>
     <w:p>
       <w:pPr>
-        <w:pBdr>
-          <w:bottom w:val="single" w:sz="8" w:space="2" w:color="1F4E79"/>
-        </w:pBdr>
-        <w:spacing w:before="100" w:after="60" w:line="240" w:lineRule="auto"/>
+        <w:spacing w:after="40" w:line="240" w:lineRule="auto"/>
+        <w:rPr>
+          <w:rFonts w:cs="Calibri"/>
+          <w:sz w:val="22"/>
+          <w:szCs w:val="24"/>
+        </w:rPr>
       </w:pPr>
       <w:r>
         <w:rPr>
           <w:rFonts w:cs="Calibri"/>
           <w:b/>
-          <w:color w:val="1F4E79"/>
+          <w:color w:val="000000"/>
           <w:sz w:val="22"/>
+          <w:szCs w:val="24"/>
         </w:rPr>
-        <w:t>CERTIFICATIONS</w:t>
+        <w:t xml:space="preserve">Security &amp; Infra: </w:t>
       </w:r>
-    </w:p>
-    <w:p>
-      <w:pPr>
-        <w:spacing w:after="20" w:line="240" w:lineRule="auto"/>
-        <w:ind w:left="245" w:hanging="245"/>
-      </w:pPr>
       <w:r>
         <w:rPr>
           <w:rFonts w:cs="Calibri"/>
           <w:color w:val="000000"/>
+          <w:sz w:val="22"/>
+          <w:szCs w:val="24"/>
         </w:rPr>
-        <w:t>•  CS50: Introduction to Computer Science — Harvard University (edX)</w:t>
-      </w:r>
-    </w:p>
-    <w:p>
-      <w:pPr>
-        <w:spacing w:after="20" w:line="240" w:lineRule="auto"/>
-        <w:ind w:left="245" w:hanging="245"/>
-      </w:pPr>
-      <w:r>
-        <w:rPr>
-          <w:rFonts w:cs="Calibri"/>
-          <w:color w:val="000000"/>
-        </w:rPr>
-        <w:t>•  Machine Learning Crash Course — Google</w:t>
-      </w:r>
-    </w:p>
-    <w:p>
-      <w:pPr>
-        <w:spacing w:after="20" w:line="240" w:lineRule="auto"/>
-        <w:ind w:left="245" w:hanging="245"/>
-      </w:pPr>
-      <w:r>
-        <w:rPr>
-          <w:rFonts w:cs="Calibri"/>
-          <w:color w:val="000000"/>
-        </w:rPr>
-        <w:t>•  Python for Data Science — NPTEL</w:t>
-      </w:r>
-    </w:p>
-    <w:p>
-      <w:pPr>
-        <w:spacing w:after="20" w:line="240" w:lineRule="auto"/>
-        <w:ind w:left="245" w:hanging="245"/>
-      </w:pPr>
-      <w:r>
-        <w:rPr>
-          <w:rFonts w:cs="Calibri"/>
-          <w:color w:val="000000"/>
-        </w:rPr>
-        <w:t>•  Demystifying Networking — IIT Bombay</w:t>
-      </w:r>
-    </w:p>
-    <w:p>
-      <w:pPr>
-        <w:spacing w:after="20" w:line="240" w:lineRule="auto"/>
-        <w:ind w:left="245" w:hanging="245"/>
-      </w:pPr>
-      <w:r>
-        <w:rPr>
-          <w:rFonts w:cs="Calibri"/>
-          <w:color w:val="000000"/>
-        </w:rPr>
-        <w:t>•  ChatGPT Prompt Engineering for Developers — DeepLearning.AI</w:t>
+        <w:t>Linux hardening (fail2ban, nftables, auditd), Docker security, adversarial ML testing, vulnerability scanning (OpenVAS, Trivy), Sigma rules, CI/CD security</w:t>
       </w:r>
     </w:p>
     <w:sectPr>
@@ -1010,7 +1281,7 @@
 </file>
 
 <file path=word/numbering.xml><?xml version="1.0" encoding="utf-8"?>
-<w:numbering xmlns:wpc="http://schemas.microsoft.com/office/word/2010/wordprocessingCanvas" xmlns:cx="http://schemas.microsoft.com/office/drawing/2014/chartex" xmlns:cx1="http://schemas.microsoft.com/office/drawing/2015/9/8/chartex" xmlns:cx2="http://schemas.microsoft.com/office/drawing/2015/10/21/chartex" xmlns:cx3="http://schemas.microsoft.com/office/drawing/2016/5/9/chartex" xmlns:cx4="http://schemas.microsoft.com/office/drawing/2016/5/10/chartex" xmlns:cx5="http://schemas.microsoft.com/office/drawing/2016/5/11/chartex" xmlns:cx6="http://schemas.microsoft.com/office/drawing/2016/5/12/chartex" xmlns:cx7="http://schemas.microsoft.com/office/drawing/2016/5/13/chartex" xmlns:cx8="http://schemas.microsoft.com/office/drawing/2016/5/14/chartex" xmlns:mc="http://schemas.openxmlformats.org/markup-compatibility/2006" xmlns:aink="http://schemas.microsoft.com/office/drawing/2016/ink" xmlns:am3d="http://schemas.microsoft.com/office/drawing/2017/model3d" xmlns:o="urn:schemas-microsoft-com:office:office" xmlns:oel="http://schemas.microsoft.com/office/2019/extlst" xmlns:r="http://schemas.openxmlformats.org/officeDocument/2006/relationships" xmlns:m="http://schemas.openxmlformats.org/officeDocument/2006/math" xmlns:v="urn:schemas-microsoft-com:vml" xmlns:wp14="http://schemas.microsoft.com/office/word/2010/wordprocessingDrawing" xmlns:wp="http://schemas.openxmlformats.org/drawingml/2006/wordprocessingDrawing" xmlns:w10="urn:schemas-microsoft-com:office:word" xmlns:w="http://schemas.openxmlformats.org/wordprocessingml/2006/main" xmlns:w14="http://schemas.microsoft.com/office/word/2010/wordml" xmlns:w15="http://schemas.microsoft.com/office/word/2012/wordml" xmlns:w16cei="http://schemas.microsoft.com/office/word/2026/wordml/cei" xmlns:w16cex="http://schemas.microsoft.com/office/word/2018/wordml/cex" xmlns:w16cid="http://schemas.microsoft.com/office/word/2016/wordml/cid" xmlns:w16="http://schemas.microsoft.com/office/word/2018/wordml" xmlns:w16du="http://schemas.microsoft.com/office/word/2023/wordml/word16du" xmlns:w16sdtdh="http://schemas.microsoft.com/office/word/2020/wordml/sdtdatahash" xmlns:w16sdtfl="http://schemas.microsoft.com/office/word/2024/wordml/sdtformatlock" xmlns:w16se="http://schemas.microsoft.com/office/word/2015/wordml/symex" xmlns:wpg="http://schemas.microsoft.com/office/word/2010/wordprocessingGroup" xmlns:wpi="http://schemas.microsoft.com/office/word/2010/wordprocessingInk" xmlns:wne="http://schemas.microsoft.com/office/word/2006/wordml" xmlns:wps="http://schemas.microsoft.com/office/word/2010/wordprocessingShape" mc:Ignorable="w14 w15 w16se w16cid w16 w16cex w16sdtdh w16sdtfl w16du wp14">
+<w:numbering xmlns:wpc="http://schemas.microsoft.com/office/word/2010/wordprocessingCanvas" xmlns:cx="http://schemas.microsoft.com/office/drawing/2014/chartex" xmlns:cx1="http://schemas.microsoft.com/office/drawing/2015/9/8/chartex" xmlns:cx2="http://schemas.microsoft.com/office/drawing/2015/10/21/chartex" xmlns:cx3="http://schemas.microsoft.com/office/drawing/2016/5/9/chartex" xmlns:cx4="http://schemas.microsoft.com/office/drawing/2016/5/10/chartex" xmlns:cx5="http://schemas.microsoft.com/office/drawing/2016/5/11/chartex" xmlns:cx6="http://schemas.microsoft.com/office/drawing/2016/5/12/chartex" xmlns:cx7="http://schemas.microsoft.com/office/drawing/2016/5/13/chartex" xmlns:cx8="http://schemas.microsoft.com/office/drawing/2016/5/14/chartex" xmlns:mc="http://schemas.openxmlformats.org/markup-compatibility/2006" xmlns:aink="http://schemas.microsoft.com/office/drawing/2016/ink" xmlns:am3d="http://schemas.microsoft.com/office/drawing/2017/model3d" xmlns:o="urn:schemas-microsoft-com:office:office" xmlns:oel="http://schemas.microsoft.com/office/2019/extlst" xmlns:r="http://schemas.openxmlformats.org/officeDocument/2006/relationships" xmlns:m="http://schemas.openxmlformats.org/officeDocument/2006/math" xmlns:v="urn:schemas-microsoft-com:vml" xmlns:wp14="http://schemas.microsoft.com/office/word/2010/wordprocessingDrawing" xmlns:wp="http://schemas.openxmlformats.org/drawingml/2006/wordprocessingDrawing" xmlns:w10="urn:schemas-microsoft-com:office:word" xmlns:w="http://schemas.openxmlformats.org/wordprocessingml/2006/main" xmlns:w14="http://schemas.microsoft.com/office/word/2010/wordml" xmlns:w15="http://schemas.microsoft.com/office/word/2012/wordml" xmlns:w16cex="http://schemas.microsoft.com/office/word/2018/wordml/cex" xmlns:w16cid="http://schemas.microsoft.com/office/word/2016/wordml/cid" xmlns:w16="http://schemas.microsoft.com/office/word/2018/wordml" xmlns:w16du="http://schemas.microsoft.com/office/word/2023/wordml/word16du" xmlns:w16sdtdh="http://schemas.microsoft.com/office/word/2020/wordml/sdtdatahash" xmlns:w16sdtfl="http://schemas.microsoft.com/office/word/2024/wordml/sdtformatlock" xmlns:w16se="http://schemas.microsoft.com/office/word/2015/wordml/symex" xmlns:wpg="http://schemas.microsoft.com/office/word/2010/wordprocessingGroup" xmlns:wpi="http://schemas.microsoft.com/office/word/2010/wordprocessingInk" xmlns:wne="http://schemas.microsoft.com/office/word/2006/wordml" xmlns:wps="http://schemas.microsoft.com/office/word/2010/wordprocessingShape" mc:Ignorable="w14 w15 w16se w16cid w16 w16cex w16sdtdh w16sdtfl w16du wp14">
   <w:abstractNum w:abstractNumId="0" w15:restartNumberingAfterBreak="0">
     <w:nsid w:val="FFFFFF7C"/>
     <w:multiLevelType w:val="singleLevel"/>
@@ -1182,31 +1453,31 @@
       </w:rPr>
     </w:lvl>
   </w:abstractNum>
-  <w:num w:numId="1" w16cid:durableId="1087000376">
+  <w:num w:numId="1" w16cid:durableId="1207840363">
     <w:abstractNumId w:val="8"/>
   </w:num>
-  <w:num w:numId="2" w16cid:durableId="826433186">
+  <w:num w:numId="2" w16cid:durableId="1456950358">
     <w:abstractNumId w:val="6"/>
   </w:num>
-  <w:num w:numId="3" w16cid:durableId="122501899">
+  <w:num w:numId="3" w16cid:durableId="2136488162">
     <w:abstractNumId w:val="5"/>
   </w:num>
-  <w:num w:numId="4" w16cid:durableId="1418866796">
+  <w:num w:numId="4" w16cid:durableId="1045566378">
     <w:abstractNumId w:val="4"/>
   </w:num>
-  <w:num w:numId="5" w16cid:durableId="118450903">
+  <w:num w:numId="5" w16cid:durableId="853304305">
     <w:abstractNumId w:val="7"/>
   </w:num>
-  <w:num w:numId="6" w16cid:durableId="1954166002">
+  <w:num w:numId="6" w16cid:durableId="1566721789">
     <w:abstractNumId w:val="3"/>
   </w:num>
-  <w:num w:numId="7" w16cid:durableId="21131351">
+  <w:num w:numId="7" w16cid:durableId="1021668206">
     <w:abstractNumId w:val="2"/>
   </w:num>
-  <w:num w:numId="8" w16cid:durableId="1603491032">
+  <w:num w:numId="8" w16cid:durableId="1260406091">
     <w:abstractNumId w:val="1"/>
   </w:num>
-  <w:num w:numId="9" w16cid:durableId="1924023335">
+  <w:num w:numId="9" w16cid:durableId="1597205266">
     <w:abstractNumId w:val="0"/>
   </w:num>
 </w:numbering>
@@ -1603,7 +1874,7 @@
     <w:qFormat/>
     <w:rsid w:val="00FC693F"/>
     <w:rPr>
-      <w:rFonts w:ascii="Calibri" w:eastAsia="Calibri" w:hAnsi="Calibri"/>
+      <w:rFonts w:ascii="Calibri" w:hAnsi="Calibri"/>
       <w:sz w:val="20"/>
     </w:rPr>
   </w:style>

</xml_diff>